<commit_message>
fix: corrige keyword stuffing e cobertura de palavras-chave no gerador de currículos
</commit_message>
<xml_diff>
--- a/curriculo_ats_template.docx
+++ b/curriculo_ats_template.docx
@@ -17,7 +17,7 @@
           <w:szCs w:val="40"/>
           <w:rtl w:val="0"/>
         </w:rPr>
-        <w:t xml:space="preserve">Fulano</w:t>
+        <w:t xml:space="preserve">Otávio Figueredo Alves</w:t>
       </w:r>
       <w:r>
         <w:rPr>
@@ -50,7 +50,35 @@
           <w:rFonts w:ascii="Calibri" w:cs="Calibri" w:eastAsia="Calibri" w:hAnsi="Calibri"/>
           <w:rtl w:val="0"/>
         </w:rPr>
-        <w:t xml:space="preserve">Cidade, Estado |Telefone| Email</w:t>
+        <w:t xml:space="preserve">São Benedito, Ceará | +55 88 98172-6835 | </w:t>
+      </w:r>
+      <w:hyperlink r:id="rId6">
+        <w:r>
+          <w:rPr>
+            <w:rFonts w:ascii="Calibri" w:cs="Calibri" w:eastAsia="Calibri" w:hAnsi="Calibri"/>
+            <w:color w:val="1155cc"/>
+            <w:u w:val="single"/>
+            <w:rtl w:val="0"/>
+          </w:rPr>
+          <w:t xml:space="preserve">otaviofigueredo.dev@gmail.com</w:t>
+        </w:r>
+      </w:hyperlink>
+      <w:r>
+        <w:rPr>
+          <w:rtl w:val="0"/>
+        </w:rPr>
+      </w:r>
+    </w:p>
+    <w:p>
+      <w:pPr>
+        <w:rPr>
+          <w:rFonts w:ascii="Calibri" w:cs="Calibri" w:eastAsia="Calibri" w:hAnsi="Calibri"/>
+        </w:rPr>
+      </w:pPr>
+      <w:r>
+        <w:rPr>
+          <w:rtl w:val="0"/>
+        </w:rPr>
       </w:r>
     </w:p>
     <w:p>
@@ -68,59 +96,7 @@
           <w:szCs w:val="32"/>
           <w:rtl w:val="0"/>
         </w:rPr>
-        <w:t xml:space="preserve">Objetivo</w:t>
-      </w:r>
-      <w:r>
-        <w:rPr>
-          <w:rtl w:val="0"/>
-        </w:rPr>
-      </w:r>
-    </w:p>
-    <w:p>
-      <w:pPr>
-        <w:rPr>
-          <w:rFonts w:ascii="Calibri" w:cs="Calibri" w:eastAsia="Calibri" w:hAnsi="Calibri"/>
-        </w:rPr>
-      </w:pPr>
-      <w:r>
-        <w:rPr>
-          <w:rFonts w:ascii="Calibri" w:cs="Calibri" w:eastAsia="Calibri" w:hAnsi="Calibri"/>
-          <w:rtl w:val="0"/>
-        </w:rPr>
-        <w:t xml:space="preserve">{{ objetivo_adaptado }}</w:t>
-      </w:r>
-    </w:p>
-    <w:p>
-      <w:pPr>
-        <w:rPr>
-          <w:rFonts w:ascii="Calibri" w:cs="Calibri" w:eastAsia="Calibri" w:hAnsi="Calibri"/>
-          <w:color w:val="d7ba7d"/>
-          <w:sz w:val="19"/>
-          <w:szCs w:val="19"/>
-        </w:rPr>
-      </w:pPr>
-      <w:r>
-        <w:rPr>
-          <w:rtl w:val="0"/>
-        </w:rPr>
-      </w:r>
-    </w:p>
-    <w:p>
-      <w:pPr>
-        <w:rPr>
-          <w:rFonts w:ascii="Calibri" w:cs="Calibri" w:eastAsia="Calibri" w:hAnsi="Calibri"/>
-        </w:rPr>
-      </w:pPr>
-      <w:r>
-        <w:rPr>
-          <w:rFonts w:ascii="Calibri" w:cs="Calibri" w:eastAsia="Calibri" w:hAnsi="Calibri"/>
-          <w:b w:val="1"/>
-          <w:bCs w:val="1"/>
-          <w:sz w:val="32"/>
-          <w:szCs w:val="32"/>
-          <w:rtl w:val="0"/>
-        </w:rPr>
-        <w:t xml:space="preserve">Highlights</w:t>
+        <w:t xml:space="preserve">Resumo</w:t>
       </w:r>
       <w:r>
         <w:rPr>
@@ -303,61 +279,194 @@
       <w:pPr>
         <w:rPr>
           <w:rFonts w:ascii="Calibri" w:cs="Calibri" w:eastAsia="Calibri" w:hAnsi="Calibri"/>
-          <w:b w:val="1"/>
-          <w:bCs w:val="1"/>
+        </w:rPr>
+      </w:pPr>
+      <w:r>
+        <w:rPr>
+          <w:rtl w:val="0"/>
+        </w:rPr>
+      </w:r>
+    </w:p>
+    <w:p>
+      <w:pPr>
+        <w:rPr>
+          <w:rFonts w:ascii="Calibri" w:cs="Calibri" w:eastAsia="Calibri" w:hAnsi="Calibri"/>
+        </w:rPr>
+      </w:pPr>
+      <w:r>
+        <w:rPr>
+          <w:rFonts w:ascii="Calibri" w:cs="Calibri" w:eastAsia="Calibri" w:hAnsi="Calibri"/>
+          <w:b w:val="1"/>
+          <w:bCs w:val="1"/>
+          <w:sz w:val="32"/>
+          <w:szCs w:val="32"/>
+          <w:rtl w:val="0"/>
+        </w:rPr>
+        <w:t xml:space="preserve">Principais Projetos</w:t>
+      </w:r>
+      <w:r>
+        <w:rPr>
+          <w:rtl w:val="0"/>
+        </w:rPr>
+      </w:r>
+    </w:p>
+    <w:p>
+      <w:pPr>
+        <w:numPr>
+          <w:ilvl w:val="0"/>
+          <w:numId w:val="1"/>
+        </w:numPr>
+        <w:spacing w:after="0" w:afterAutospacing="0"/>
+        <w:ind w:left="720" w:hanging="360"/>
+        <w:rPr>
+          <w:rFonts w:ascii="Calibri" w:cs="Calibri" w:eastAsia="Calibri" w:hAnsi="Calibri"/>
+          <w:u w:val="none"/>
+        </w:rPr>
+      </w:pPr>
+      <w:r>
+        <w:rPr>
+          <w:rFonts w:ascii="Calibri" w:cs="Calibri" w:eastAsia="Calibri" w:hAnsi="Calibri"/>
+          <w:b w:val="1"/>
+          <w:bCs w:val="1"/>
+          <w:rtl w:val="0"/>
+        </w:rPr>
+        <w:t>Desenvolvi 1 plataforma SaaS de MDM:</w:t>
+      </w:r>
+      <w:r>
+        <w:rPr>
+          <w:rFonts w:ascii="Calibri" w:cs="Calibri" w:eastAsia="Calibri" w:hAnsi="Calibri"/>
+          <w:rtl w:val="0"/>
+        </w:rPr>
+        <w:t xml:space="preserve"> API B2B multi-tenant em Laravel (Fortify/Sanctum), SPA em Vue 3, integrações assíncronas e testes automatizados.</w:t>
+      </w:r>
+    </w:p>
+    <w:p>
+      <w:pPr>
+        <w:numPr>
+          <w:ilvl w:val="0"/>
+          <w:numId w:val="1"/>
+        </w:numPr>
+        <w:spacing w:after="0" w:afterAutospacing="0"/>
+        <w:ind w:left="720" w:hanging="360"/>
+        <w:rPr>
+          <w:rFonts w:ascii="Calibri" w:cs="Calibri" w:eastAsia="Calibri" w:hAnsi="Calibri"/>
+          <w:u w:val="none"/>
+        </w:rPr>
+      </w:pPr>
+      <w:r>
+        <w:rPr>
+          <w:rFonts w:ascii="Calibri" w:cs="Calibri" w:eastAsia="Calibri" w:hAnsi="Calibri"/>
+          <w:b w:val="1"/>
+          <w:bCs w:val="1"/>
+          <w:rtl w:val="0"/>
+        </w:rPr>
+        <w:t>Automatizei 1 bot institucional na Fiocruz:</w:t>
+      </w:r>
+      <w:r>
+        <w:rPr>
+          <w:rFonts w:ascii="Calibri" w:cs="Calibri" w:eastAsia="Calibri" w:hAnsi="Calibri"/>
+          <w:rtl w:val="0"/>
+        </w:rPr>
+        <w:t xml:space="preserve"> bot em Python e aplicação backend em PHP para processamento de dados e eficiência operacional.</w:t>
+      </w:r>
+    </w:p>
+    <w:p>
+      <w:pPr>
+        <w:numPr>
+          <w:ilvl w:val="0"/>
+          <w:numId w:val="1"/>
+        </w:numPr>
+        <w:spacing w:after="0" w:afterAutospacing="0"/>
+        <w:ind w:left="720" w:hanging="360"/>
+        <w:rPr>
+          <w:rFonts w:ascii="Calibri" w:cs="Calibri" w:eastAsia="Calibri" w:hAnsi="Calibri"/>
+          <w:u w:val="none"/>
+        </w:rPr>
+      </w:pPr>
+      <w:r>
+        <w:rPr>
+          <w:rFonts w:ascii="Calibri" w:cs="Calibri" w:eastAsia="Calibri" w:hAnsi="Calibri"/>
+          <w:b w:val="1"/>
+          <w:bCs w:val="1"/>
+          <w:rtl w:val="0"/>
+        </w:rPr>
+        <w:t>Implementei 1 sistema de gestão de pacientes:</w:t>
+      </w:r>
+      <w:r>
+        <w:rPr>
+          <w:rFonts w:ascii="Calibri" w:cs="Calibri" w:eastAsia="Calibri" w:hAnsi="Calibri"/>
+          <w:rtl w:val="0"/>
+        </w:rPr>
+        <w:t xml:space="preserve"> API REST com Vue, Laravel, Docker e MySQL.</w:t>
+      </w:r>
+    </w:p>
+    <w:p>
+      <w:pPr>
+        <w:numPr>
+          <w:ilvl w:val="0"/>
+          <w:numId w:val="1"/>
+        </w:numPr>
+        <w:ind w:left="720" w:hanging="360"/>
+        <w:rPr>
+          <w:rFonts w:ascii="Calibri" w:cs="Calibri" w:eastAsia="Calibri" w:hAnsi="Calibri"/>
+          <w:u w:val="none"/>
+        </w:rPr>
+      </w:pPr>
+      <w:r>
+        <w:rPr>
+          <w:rFonts w:ascii="Calibri" w:cs="Calibri" w:eastAsia="Calibri" w:hAnsi="Calibri"/>
+          <w:b w:val="1"/>
+          <w:bCs w:val="1"/>
+          <w:rtl w:val="0"/>
+        </w:rPr>
+        <w:t>Construí 3 projetos web e desktop:</w:t>
+      </w:r>
+      <w:r>
+        <w:rPr>
+          <w:rFonts w:ascii="Calibri" w:cs="Calibri" w:eastAsia="Calibri" w:hAnsi="Calibri"/>
+          <w:rtl w:val="0"/>
+        </w:rPr>
+        <w:t xml:space="preserve"> portfólio MVC, gerador de guias INSS (Python) e relatórios de viagem (PHP).</w:t>
+      </w:r>
+    </w:p>
+    <w:p>
+      <w:pPr>
+        <w:rPr>
+          <w:rFonts w:ascii="Calibri" w:cs="Calibri" w:eastAsia="Calibri" w:hAnsi="Calibri"/>
+        </w:rPr>
+      </w:pPr>
+      <w:r>
+        <w:rPr>
+          <w:rFonts w:ascii="Calibri" w:cs="Calibri" w:eastAsia="Calibri" w:hAnsi="Calibri"/>
+          <w:b w:val="1"/>
+          <w:bCs w:val="1"/>
+          <w:sz w:val="32"/>
+          <w:szCs w:val="32"/>
+          <w:rtl w:val="0"/>
+        </w:rPr>
+        <w:t xml:space="preserve">Formação</w:t>
+      </w:r>
+      <w:r>
+        <w:rPr>
+          <w:rtl w:val="0"/>
+        </w:rPr>
+      </w:r>
+    </w:p>
+    <w:p>
+      <w:pPr>
+        <w:rPr>
+          <w:rFonts w:ascii="Calibri" w:cs="Calibri" w:eastAsia="Calibri" w:hAnsi="Calibri"/>
+        </w:rPr>
+      </w:pPr>
+      <w:r>
+        <w:rPr>
+          <w:rFonts w:ascii="Calibri" w:cs="Calibri" w:eastAsia="Calibri" w:hAnsi="Calibri"/>
           <w:i w:val="1"/>
           <w:iCs w:val="1"/>
-          <w:sz w:val="36"/>
-          <w:szCs w:val="36"/>
-        </w:rPr>
-      </w:pPr>
-      <w:r>
-        <w:rPr>
-          <w:rFonts w:ascii="Calibri" w:cs="Calibri" w:eastAsia="Calibri" w:hAnsi="Calibri"/>
-          <w:i w:val="1"/>
-          <w:iCs w:val="1"/>
-          <w:rtl w:val="0"/>
-        </w:rPr>
-        <w:t xml:space="preserve">{{ titulo_experiencia_4 }}</w:t>
-      </w:r>
-      <w:r>
-        <w:rPr>
-          <w:rtl w:val="0"/>
-        </w:rPr>
-      </w:r>
-    </w:p>
-    <w:p>
-      <w:pPr>
-        <w:rPr>
-          <w:rFonts w:ascii="Calibri" w:cs="Calibri" w:eastAsia="Calibri" w:hAnsi="Calibri"/>
-        </w:rPr>
-      </w:pPr>
-      <w:r>
-        <w:rPr>
-          <w:rFonts w:ascii="Calibri" w:cs="Calibri" w:eastAsia="Calibri" w:hAnsi="Calibri"/>
-          <w:rtl w:val="0"/>
-        </w:rPr>
-        <w:t xml:space="preserve">{{ experiencia_adaptada_4 }}</w:t>
-      </w:r>
-    </w:p>
-    <w:p>
-      <w:pPr>
-        <w:rPr>
-          <w:rFonts w:ascii="Calibri" w:cs="Calibri" w:eastAsia="Calibri" w:hAnsi="Calibri"/>
-        </w:rPr>
-      </w:pPr>
-      <w:r>
-        <w:rPr>
-          <w:rtl w:val="0"/>
-        </w:rPr>
-      </w:r>
-    </w:p>
-    <w:p>
-      <w:pPr>
-        <w:rPr>
-          <w:rFonts w:ascii="Calibri" w:cs="Calibri" w:eastAsia="Calibri" w:hAnsi="Calibri"/>
-        </w:rPr>
-      </w:pPr>
+          <w:rtl w:val="0"/>
+        </w:rPr>
+        <w:t>Bacharelado em Ciência da Computação - IFCE - 2026 – Atual</w:t>
+      </w:r>
       <w:r>
         <w:rPr>
           <w:rtl w:val="0"/>
@@ -391,35 +500,184 @@
           <w:szCs w:val="32"/>
           <w:rtl w:val="0"/>
         </w:rPr>
-        <w:t xml:space="preserve">Projetos e Conquistas</w:t>
-      </w:r>
-      <w:r>
-        <w:rPr>
-          <w:rtl w:val="0"/>
-        </w:rPr>
-      </w:r>
-    </w:p>
-    <w:p>
-      <w:pPr>
-        <w:rPr>
-          <w:rFonts w:ascii="Calibri" w:cs="Calibri" w:eastAsia="Calibri" w:hAnsi="Calibri"/>
-        </w:rPr>
-      </w:pPr>
-      <w:r>
-        <w:rPr>
-          <w:rFonts w:ascii="Calibri" w:cs="Calibri" w:eastAsia="Calibri" w:hAnsi="Calibri"/>
-          <w:i w:val="1"/>
-          <w:iCs w:val="1"/>
-          <w:rtl w:val="0"/>
-        </w:rPr>
-        <w:t xml:space="preserve">Projeto/Conquista 1:</w:t>
-      </w:r>
-      <w:r>
-        <w:rPr>
-          <w:rFonts w:ascii="Calibri" w:cs="Calibri" w:eastAsia="Calibri" w:hAnsi="Calibri"/>
-          <w:rtl w:val="0"/>
-        </w:rPr>
-        <w:t xml:space="preserve"> Explicação do projeto/conquista</w:t>
+        <w:t xml:space="preserve">Certificações</w:t>
+      </w:r>
+      <w:r>
+        <w:rPr>
+          <w:rtl w:val="0"/>
+        </w:rPr>
+      </w:r>
+    </w:p>
+    <w:p>
+      <w:pPr>
+        <w:numPr>
+          <w:ilvl w:val="0"/>
+          <w:numId w:val="2"/>
+        </w:numPr>
+        <w:spacing w:after="0" w:afterAutospacing="0"/>
+        <w:ind w:left="720" w:hanging="360"/>
+        <w:rPr>
+          <w:rFonts w:ascii="Calibri" w:cs="Calibri" w:eastAsia="Calibri" w:hAnsi="Calibri"/>
+        </w:rPr>
+      </w:pPr>
+      <w:r>
+        <w:rPr>
+          <w:rFonts w:ascii="Calibri" w:cs="Calibri" w:eastAsia="Calibri" w:hAnsi="Calibri"/>
+          <w:b w:val="0"/>
+          <w:bCs w:val="1"/>
+          <w:rtl w:val="0"/>
+        </w:rPr>
+        <w:t>Concluí 12 certificações relevantes:</w:t>
+      </w:r>
+      <w:r>
+        <w:rPr>
+          <w:rFonts w:ascii="Calibri" w:cs="Calibri" w:eastAsia="Calibri" w:hAnsi="Calibri"/>
+          <w:rtl w:val="0"/>
+        </w:rPr>
+      </w:r>
+    </w:p>
+    <w:p>
+      <w:pPr>
+        <w:numPr>
+          <w:ilvl w:val="0"/>
+          <w:numId w:val="2"/>
+        </w:numPr>
+        <w:spacing w:after="0" w:afterAutospacing="0"/>
+        <w:ind w:left="720" w:hanging="360"/>
+        <w:rPr>
+          <w:rFonts w:ascii="Calibri" w:cs="Calibri" w:eastAsia="Calibri" w:hAnsi="Calibri"/>
+        </w:rPr>
+      </w:pPr>
+      <w:r>
+        <w:rPr>
+          <w:rFonts w:ascii="Calibri" w:cs="Calibri" w:eastAsia="Calibri" w:hAnsi="Calibri"/>
+          <w:b w:val="1"/>
+          <w:bCs w:val="1"/>
+          <w:rtl w:val="0"/>
+        </w:rPr>
+        <w:t>Back-end:</w:t>
+      </w:r>
+      <w:r>
+        <w:rPr>
+          <w:rFonts w:ascii="Calibri" w:cs="Calibri" w:eastAsia="Calibri" w:hAnsi="Calibri"/>
+          <w:rtl w:val="0"/>
+        </w:rPr>
+        <w:t xml:space="preserve"> Introdução ao Laravel 12 (2026), Programação Orientada a Objetos no PHP (2025), Introdução ao PHP (2025), Banco de Dados e PDO (2025) e SQL do Zero (2025) — B7Web.</w:t>
+      </w:r>
+    </w:p>
+    <w:p>
+      <w:pPr>
+        <w:numPr>
+          <w:ilvl w:val="0"/>
+          <w:numId w:val="2"/>
+        </w:numPr>
+        <w:spacing w:after="0" w:afterAutospacing="0"/>
+        <w:ind w:left="720" w:hanging="360"/>
+        <w:rPr>
+          <w:rFonts w:ascii="Calibri" w:cs="Calibri" w:eastAsia="Calibri" w:hAnsi="Calibri"/>
+        </w:rPr>
+      </w:pPr>
+      <w:r>
+        <w:rPr>
+          <w:rFonts w:ascii="Calibri" w:cs="Calibri" w:eastAsia="Calibri" w:hAnsi="Calibri"/>
+          <w:b w:val="1"/>
+          <w:bCs w:val="1"/>
+          <w:rtl w:val="0"/>
+        </w:rPr>
+        <w:t>Front-end:</w:t>
+      </w:r>
+      <w:r>
+        <w:rPr>
+          <w:rFonts w:ascii="Calibri" w:cs="Calibri" w:eastAsia="Calibri" w:hAnsi="Calibri"/>
+          <w:rtl w:val="0"/>
+        </w:rPr>
+        <w:t xml:space="preserve"> Front-end Day – Vue.js (Front-End CE, 2025), JavaScript Fundamentos (B7Web, 2025) e HTML5 &amp; CSS3 (B7Web, 2024).</w:t>
+      </w:r>
+    </w:p>
+    <w:p>
+      <w:pPr>
+        <w:numPr>
+          <w:ilvl w:val="0"/>
+          <w:numId w:val="2"/>
+        </w:numPr>
+        <w:spacing w:after="0" w:afterAutospacing="0"/>
+        <w:ind w:left="720" w:hanging="360"/>
+        <w:rPr>
+          <w:rFonts w:ascii="Calibri" w:cs="Calibri" w:eastAsia="Calibri" w:hAnsi="Calibri"/>
+        </w:rPr>
+      </w:pPr>
+      <w:r>
+        <w:rPr>
+          <w:rFonts w:ascii="Calibri" w:cs="Calibri" w:eastAsia="Calibri" w:hAnsi="Calibri"/>
+          <w:b w:val="1"/>
+          <w:bCs w:val="1"/>
+          <w:rtl w:val="0"/>
+        </w:rPr>
+        <w:t>Cloud:</w:t>
+      </w:r>
+      <w:r>
+        <w:rPr>
+          <w:rFonts w:ascii="Calibri" w:cs="Calibri" w:eastAsia="Calibri" w:hAnsi="Calibri"/>
+          <w:rtl w:val="0"/>
+        </w:rPr>
+        <w:t xml:space="preserve"> AWS Academy Cloud Foundations (AWS, 2023), Noções Básicas de Nuvem (Huawei, 2024) e Capacita Brasil TIC 20 – Cloud Computing (IFCE, 2025).</w:t>
+      </w:r>
+    </w:p>
+    <w:p>
+      <w:pPr>
+        <w:numPr>
+          <w:ilvl w:val="0"/>
+          <w:numId w:val="2"/>
+        </w:numPr>
+        <w:spacing w:after="0" w:afterAutospacing="0"/>
+        <w:ind w:left="720" w:hanging="360"/>
+        <w:rPr>
+          <w:rFonts w:ascii="Calibri" w:cs="Calibri" w:eastAsia="Calibri" w:hAnsi="Calibri"/>
+        </w:rPr>
+      </w:pPr>
+      <w:r>
+        <w:rPr>
+          <w:rFonts w:ascii="Calibri" w:cs="Calibri" w:eastAsia="Calibri" w:hAnsi="Calibri"/>
+          <w:b w:val="1"/>
+          <w:bCs w:val="1"/>
+          <w:rtl w:val="0"/>
+        </w:rPr>
+        <w:t>Full Stack:</w:t>
+      </w:r>
+      <w:r>
+        <w:rPr>
+          <w:rFonts w:ascii="Calibri" w:cs="Calibri" w:eastAsia="Calibri" w:hAnsi="Calibri"/>
+          <w:rtl w:val="0"/>
+        </w:rPr>
+        <w:t xml:space="preserve"> Geração Tech (2025).</w:t>
+      </w:r>
+    </w:p>
+    <w:p>
+      <w:pPr>
+        <w:numPr>
+          <w:ilvl w:val="0"/>
+          <w:numId w:val="2"/>
+        </w:numPr>
+        <w:ind w:left="720" w:hanging="360"/>
+        <w:rPr>
+          <w:rFonts w:ascii="Calibri" w:cs="Calibri" w:eastAsia="Calibri" w:hAnsi="Calibri"/>
+        </w:rPr>
+      </w:pPr>
+      <w:r>
+        <w:rPr>
+          <w:rFonts w:ascii="Calibri" w:cs="Calibri" w:eastAsia="Calibri" w:hAnsi="Calibri"/>
+          <w:b w:val="1"/>
+          <w:bCs w:val="1"/>
+          <w:rtl w:val="0"/>
+        </w:rPr>
+        <w:t>Conquistei a medalha de bronze</w:t>
+      </w:r>
+      <w:r>
+        <w:rPr>
+          <w:rFonts w:ascii="Calibri" w:cs="Calibri" w:eastAsia="Calibri" w:hAnsi="Calibri"/>
+          <w:rtl w:val="0"/>
+        </w:rPr>
+        <w:t xml:space="preserve"> na Olimpíada Brasileira de Astronomia e Astronáutica (OBA) 2020.</w:t>
       </w:r>
     </w:p>
     <w:p>
@@ -449,175 +707,7 @@
           <w:szCs w:val="32"/>
           <w:rtl w:val="0"/>
         </w:rPr>
-        <w:t xml:space="preserve">Educação</w:t>
-      </w:r>
-      <w:r>
-        <w:rPr>
-          <w:rtl w:val="0"/>
-        </w:rPr>
-      </w:r>
-    </w:p>
-    <w:p>
-      <w:pPr>
-        <w:rPr>
-          <w:rFonts w:ascii="Calibri" w:cs="Calibri" w:eastAsia="Calibri" w:hAnsi="Calibri"/>
-        </w:rPr>
-      </w:pPr>
-      <w:r>
-        <w:rPr>
-          <w:rFonts w:ascii="Calibri" w:cs="Calibri" w:eastAsia="Calibri" w:hAnsi="Calibri"/>
-          <w:i w:val="1"/>
-          <w:iCs w:val="1"/>
-          <w:rtl w:val="0"/>
-        </w:rPr>
-        <w:t xml:space="preserve">Curso - Faculdade - Data inicio - Data final ou Presente/Atual</w:t>
-      </w:r>
-      <w:r>
-        <w:rPr>
-          <w:rtl w:val="0"/>
-        </w:rPr>
-      </w:r>
-    </w:p>
-    <w:p>
-      <w:pPr>
-        <w:rPr>
-          <w:rFonts w:ascii="Calibri" w:cs="Calibri" w:eastAsia="Calibri" w:hAnsi="Calibri"/>
-        </w:rPr>
-      </w:pPr>
-      <w:r>
-        <w:rPr>
-          <w:rFonts w:ascii="Calibri" w:cs="Calibri" w:eastAsia="Calibri" w:hAnsi="Calibri"/>
-          <w:rtl w:val="0"/>
-        </w:rPr>
-        <w:t xml:space="preserve">Principais conceitos: X,Y,Z</w:t>
-      </w:r>
-    </w:p>
-    <w:p>
-      <w:pPr>
-        <w:rPr>
-          <w:rFonts w:ascii="Calibri" w:cs="Calibri" w:eastAsia="Calibri" w:hAnsi="Calibri"/>
-        </w:rPr>
-      </w:pPr>
-      <w:r>
-        <w:rPr>
-          <w:rtl w:val="0"/>
-        </w:rPr>
-      </w:r>
-    </w:p>
-    <w:p>
-      <w:pPr>
-        <w:rPr>
-          <w:rFonts w:ascii="Calibri" w:cs="Calibri" w:eastAsia="Calibri" w:hAnsi="Calibri"/>
-        </w:rPr>
-      </w:pPr>
-      <w:r>
-        <w:rPr>
-          <w:rFonts w:ascii="Calibri" w:cs="Calibri" w:eastAsia="Calibri" w:hAnsi="Calibri"/>
-          <w:b w:val="1"/>
-          <w:bCs w:val="1"/>
-          <w:sz w:val="32"/>
-          <w:szCs w:val="32"/>
-          <w:rtl w:val="0"/>
-        </w:rPr>
-        <w:t xml:space="preserve">Certificações</w:t>
-      </w:r>
-      <w:r>
-        <w:rPr>
-          <w:rtl w:val="0"/>
-        </w:rPr>
-      </w:r>
-    </w:p>
-    <w:p>
-      <w:pPr>
-        <w:rPr>
-          <w:rFonts w:ascii="Calibri" w:cs="Calibri" w:eastAsia="Calibri" w:hAnsi="Calibri"/>
-        </w:rPr>
-      </w:pPr>
-      <w:r>
-        <w:rPr>
-          <w:rFonts w:ascii="Calibri" w:cs="Calibri" w:eastAsia="Calibri" w:hAnsi="Calibri"/>
-          <w:rtl w:val="0"/>
-        </w:rPr>
-        <w:t xml:space="preserve">Certificação/Curso X/Plataforma - Curso 1, curso 2, curso 3; Certifcação Y - Complemento Y</w:t>
-      </w:r>
-    </w:p>
-    <w:p>
-      <w:pPr>
-        <w:rPr>
-          <w:rFonts w:ascii="Calibri" w:cs="Calibri" w:eastAsia="Calibri" w:hAnsi="Calibri"/>
-        </w:rPr>
-      </w:pPr>
-      <w:r>
-        <w:rPr>
-          <w:rtl w:val="0"/>
-        </w:rPr>
-      </w:r>
-    </w:p>
-    <w:p>
-      <w:pPr>
-        <w:rPr>
-          <w:rFonts w:ascii="Calibri" w:cs="Calibri" w:eastAsia="Calibri" w:hAnsi="Calibri"/>
-        </w:rPr>
-      </w:pPr>
-      <w:r>
-        <w:rPr>
-          <w:rFonts w:ascii="Calibri" w:cs="Calibri" w:eastAsia="Calibri" w:hAnsi="Calibri"/>
-          <w:b w:val="1"/>
-          <w:bCs w:val="1"/>
-          <w:sz w:val="32"/>
-          <w:szCs w:val="32"/>
-          <w:rtl w:val="0"/>
-        </w:rPr>
-        <w:t xml:space="preserve">Idiomas</w:t>
-      </w:r>
-      <w:r>
-        <w:rPr>
-          <w:rtl w:val="0"/>
-        </w:rPr>
-      </w:r>
-    </w:p>
-    <w:p>
-      <w:pPr>
-        <w:rPr>
-          <w:rFonts w:ascii="Calibri" w:cs="Calibri" w:eastAsia="Calibri" w:hAnsi="Calibri"/>
-        </w:rPr>
-      </w:pPr>
-      <w:r>
-        <w:rPr>
-          <w:rFonts w:ascii="Calibri" w:cs="Calibri" w:eastAsia="Calibri" w:hAnsi="Calibri"/>
-          <w:rtl w:val="0"/>
-        </w:rPr>
-        <w:t xml:space="preserve">Inglês básico</w:t>
-      </w:r>
-    </w:p>
-    <w:p>
-      <w:pPr>
-        <w:rPr>
-          <w:rFonts w:ascii="Calibri" w:cs="Calibri" w:eastAsia="Calibri" w:hAnsi="Calibri"/>
-        </w:rPr>
-      </w:pPr>
-      <w:r>
-        <w:rPr>
-          <w:rtl w:val="0"/>
-        </w:rPr>
-      </w:r>
-    </w:p>
-    <w:p>
-      <w:pPr>
-        <w:rPr>
-          <w:rFonts w:ascii="Calibri" w:cs="Calibri" w:eastAsia="Calibri" w:hAnsi="Calibri"/>
-        </w:rPr>
-      </w:pPr>
-      <w:r>
-        <w:rPr>
-          <w:rFonts w:ascii="Calibri" w:cs="Calibri" w:eastAsia="Calibri" w:hAnsi="Calibri"/>
-          <w:b w:val="1"/>
-          <w:bCs w:val="1"/>
-          <w:sz w:val="32"/>
-          <w:szCs w:val="32"/>
-          <w:rtl w:val="0"/>
-        </w:rPr>
-        <w:t xml:space="preserve">Skillset</w:t>
+        <w:t xml:space="preserve">Habilidades</w:t>
       </w:r>
       <w:r>
         <w:rPr>
@@ -638,19 +728,6 @@
         </w:rPr>
         <w:t xml:space="preserve">{{ skills_adaptadas }}</w:t>
       </w:r>
-      <w:r>
-        <w:rPr>
-          <w:rtl w:val="0"/>
-        </w:rPr>
-      </w:r>
-    </w:p>
-    <w:p>
-      <w:pPr>
-        <w:ind w:left="0" w:firstLine="0"/>
-        <w:rPr>
-          <w:rFonts w:ascii="Calibri" w:cs="Calibri" w:eastAsia="Calibri" w:hAnsi="Calibri"/>
-        </w:rPr>
-      </w:pPr>
       <w:r>
         <w:rPr>
           <w:rtl w:val="0"/>
@@ -667,7 +744,234 @@
 </file>
 
 <file path=word/numbering.xml><?xml version="1.0" encoding="utf-8"?>
-<w:numbering xmlns:mc="http://schemas.openxmlformats.org/markup-compatibility/2006" xmlns:o="urn:schemas-microsoft-com:office:office" xmlns:r="http://schemas.openxmlformats.org/officeDocument/2006/relationships" xmlns:m="http://schemas.openxmlformats.org/officeDocument/2006/math" xmlns:v="urn:schemas-microsoft-com:vml" xmlns:wp="http://schemas.openxmlformats.org/drawingml/2006/wordprocessingDrawing" xmlns:w10="urn:schemas-microsoft-com:office:word" xmlns:w="http://schemas.openxmlformats.org/wordprocessingml/2006/main" xmlns:wne="http://schemas.microsoft.com/office/word/2006/wordml" xmlns:sl="http://schemas.openxmlformats.org/schemaLibrary/2006/main" xmlns:a="http://schemas.openxmlformats.org/drawingml/2006/main" xmlns:pic="http://schemas.openxmlformats.org/drawingml/2006/picture" xmlns:c="http://schemas.openxmlformats.org/drawingml/2006/chart" xmlns:lc="http://schemas.openxmlformats.org/drawingml/2006/lockedCanvas" xmlns:dgm="http://schemas.openxmlformats.org/drawingml/2006/diagram" xmlns:wps="http://schemas.microsoft.com/office/word/2010/wordprocessingShape" xmlns:wpg="http://schemas.microsoft.com/office/word/2010/wordprocessingGroup" xmlns:w14="http://schemas.microsoft.com/office/word/2010/wordml" xmlns:w15="http://schemas.microsoft.com/office/word/2012/wordml" xmlns:w16="http://schemas.microsoft.com/office/word/2018/wordml" xmlns:w16cex="http://schemas.microsoft.com/office/word/2018/wordml/cex" xmlns:w16cid="http://schemas.microsoft.com/office/word/2016/wordml/cid" xmlns="http://schemas.microsoft.com/office/tasks/2019/documenttasks" xmlns:cr="http://schemas.microsoft.com/office/comments/2020/reactions"/>
+<w:numbering xmlns:mc="http://schemas.openxmlformats.org/markup-compatibility/2006" xmlns:o="urn:schemas-microsoft-com:office:office" xmlns:r="http://schemas.openxmlformats.org/officeDocument/2006/relationships" xmlns:m="http://schemas.openxmlformats.org/officeDocument/2006/math" xmlns:v="urn:schemas-microsoft-com:vml" xmlns:wp="http://schemas.openxmlformats.org/drawingml/2006/wordprocessingDrawing" xmlns:w10="urn:schemas-microsoft-com:office:word" xmlns:w="http://schemas.openxmlformats.org/wordprocessingml/2006/main" xmlns:wne="http://schemas.microsoft.com/office/word/2006/wordml" xmlns:sl="http://schemas.openxmlformats.org/schemaLibrary/2006/main" xmlns:a="http://schemas.openxmlformats.org/drawingml/2006/main" xmlns:pic="http://schemas.openxmlformats.org/drawingml/2006/picture" xmlns:c="http://schemas.openxmlformats.org/drawingml/2006/chart" xmlns:lc="http://schemas.openxmlformats.org/drawingml/2006/lockedCanvas" xmlns:dgm="http://schemas.openxmlformats.org/drawingml/2006/diagram" xmlns:wps="http://schemas.microsoft.com/office/word/2010/wordprocessingShape" xmlns:wpg="http://schemas.microsoft.com/office/word/2010/wordprocessingGroup" xmlns:w14="http://schemas.microsoft.com/office/word/2010/wordml" xmlns:w15="http://schemas.microsoft.com/office/word/2012/wordml" xmlns:w16="http://schemas.microsoft.com/office/word/2018/wordml" xmlns:w16cex="http://schemas.microsoft.com/office/word/2018/wordml/cex" xmlns:w16cid="http://schemas.microsoft.com/office/word/2016/wordml/cid" xmlns="http://schemas.microsoft.com/office/tasks/2019/documenttasks" xmlns:cr="http://schemas.microsoft.com/office/comments/2020/reactions">
+  <w:abstractNum w:abstractNumId="1">
+    <w:lvl w:ilvl="0">
+      <w:start w:val="1"/>
+      <w:numFmt w:val="bullet"/>
+      <w:lvlText w:val="-"/>
+      <w:lvlJc w:val="left"/>
+      <w:pPr>
+        <w:ind w:left="720" w:hanging="360"/>
+      </w:pPr>
+      <w:rPr>
+        <w:u w:val="none"/>
+      </w:rPr>
+    </w:lvl>
+    <w:lvl w:ilvl="1">
+      <w:start w:val="1"/>
+      <w:numFmt w:val="bullet"/>
+      <w:lvlText w:val="-"/>
+      <w:lvlJc w:val="left"/>
+      <w:pPr>
+        <w:ind w:left="1440" w:hanging="360"/>
+      </w:pPr>
+      <w:rPr>
+        <w:u w:val="none"/>
+      </w:rPr>
+    </w:lvl>
+    <w:lvl w:ilvl="2">
+      <w:start w:val="1"/>
+      <w:numFmt w:val="bullet"/>
+      <w:lvlText w:val="-"/>
+      <w:lvlJc w:val="left"/>
+      <w:pPr>
+        <w:ind w:left="2160" w:hanging="360"/>
+      </w:pPr>
+      <w:rPr>
+        <w:u w:val="none"/>
+      </w:rPr>
+    </w:lvl>
+    <w:lvl w:ilvl="3">
+      <w:start w:val="1"/>
+      <w:numFmt w:val="bullet"/>
+      <w:lvlText w:val="-"/>
+      <w:lvlJc w:val="left"/>
+      <w:pPr>
+        <w:ind w:left="2880" w:hanging="360"/>
+      </w:pPr>
+      <w:rPr>
+        <w:u w:val="none"/>
+      </w:rPr>
+    </w:lvl>
+    <w:lvl w:ilvl="4">
+      <w:start w:val="1"/>
+      <w:numFmt w:val="bullet"/>
+      <w:lvlText w:val="-"/>
+      <w:lvlJc w:val="left"/>
+      <w:pPr>
+        <w:ind w:left="3600" w:hanging="360"/>
+      </w:pPr>
+      <w:rPr>
+        <w:u w:val="none"/>
+      </w:rPr>
+    </w:lvl>
+    <w:lvl w:ilvl="5">
+      <w:start w:val="1"/>
+      <w:numFmt w:val="bullet"/>
+      <w:lvlText w:val="-"/>
+      <w:lvlJc w:val="left"/>
+      <w:pPr>
+        <w:ind w:left="4320" w:hanging="360"/>
+      </w:pPr>
+      <w:rPr>
+        <w:u w:val="none"/>
+      </w:rPr>
+    </w:lvl>
+    <w:lvl w:ilvl="6">
+      <w:start w:val="1"/>
+      <w:numFmt w:val="bullet"/>
+      <w:lvlText w:val="-"/>
+      <w:lvlJc w:val="left"/>
+      <w:pPr>
+        <w:ind w:left="5040" w:hanging="360"/>
+      </w:pPr>
+      <w:rPr>
+        <w:u w:val="none"/>
+      </w:rPr>
+    </w:lvl>
+    <w:lvl w:ilvl="7">
+      <w:start w:val="1"/>
+      <w:numFmt w:val="bullet"/>
+      <w:lvlText w:val="-"/>
+      <w:lvlJc w:val="left"/>
+      <w:pPr>
+        <w:ind w:left="5760" w:hanging="360"/>
+      </w:pPr>
+      <w:rPr>
+        <w:u w:val="none"/>
+      </w:rPr>
+    </w:lvl>
+    <w:lvl w:ilvl="8">
+      <w:start w:val="1"/>
+      <w:numFmt w:val="bullet"/>
+      <w:lvlText w:val="-"/>
+      <w:lvlJc w:val="left"/>
+      <w:pPr>
+        <w:ind w:left="6480" w:hanging="360"/>
+      </w:pPr>
+      <w:rPr>
+        <w:u w:val="none"/>
+      </w:rPr>
+    </w:lvl>
+  </w:abstractNum>
+  <w:abstractNum w:abstractNumId="2">
+    <w:lvl w:ilvl="0">
+      <w:start w:val="1"/>
+      <w:numFmt w:val="bullet"/>
+      <w:lvlText w:val="-"/>
+      <w:lvlJc w:val="left"/>
+      <w:pPr>
+        <w:ind w:left="720" w:hanging="360"/>
+      </w:pPr>
+      <w:rPr>
+        <w:u w:val="none"/>
+      </w:rPr>
+    </w:lvl>
+    <w:lvl w:ilvl="1">
+      <w:start w:val="1"/>
+      <w:numFmt w:val="bullet"/>
+      <w:lvlText w:val="-"/>
+      <w:lvlJc w:val="left"/>
+      <w:pPr>
+        <w:ind w:left="1440" w:hanging="360"/>
+      </w:pPr>
+      <w:rPr>
+        <w:u w:val="none"/>
+      </w:rPr>
+    </w:lvl>
+    <w:lvl w:ilvl="2">
+      <w:start w:val="1"/>
+      <w:numFmt w:val="bullet"/>
+      <w:lvlText w:val="-"/>
+      <w:lvlJc w:val="left"/>
+      <w:pPr>
+        <w:ind w:left="2160" w:hanging="360"/>
+      </w:pPr>
+      <w:rPr>
+        <w:u w:val="none"/>
+      </w:rPr>
+    </w:lvl>
+    <w:lvl w:ilvl="3">
+      <w:start w:val="1"/>
+      <w:numFmt w:val="bullet"/>
+      <w:lvlText w:val="-"/>
+      <w:lvlJc w:val="left"/>
+      <w:pPr>
+        <w:ind w:left="2880" w:hanging="360"/>
+      </w:pPr>
+      <w:rPr>
+        <w:u w:val="none"/>
+      </w:rPr>
+    </w:lvl>
+    <w:lvl w:ilvl="4">
+      <w:start w:val="1"/>
+      <w:numFmt w:val="bullet"/>
+      <w:lvlText w:val="-"/>
+      <w:lvlJc w:val="left"/>
+      <w:pPr>
+        <w:ind w:left="3600" w:hanging="360"/>
+      </w:pPr>
+      <w:rPr>
+        <w:u w:val="none"/>
+      </w:rPr>
+    </w:lvl>
+    <w:lvl w:ilvl="5">
+      <w:start w:val="1"/>
+      <w:numFmt w:val="bullet"/>
+      <w:lvlText w:val="-"/>
+      <w:lvlJc w:val="left"/>
+      <w:pPr>
+        <w:ind w:left="4320" w:hanging="360"/>
+      </w:pPr>
+      <w:rPr>
+        <w:u w:val="none"/>
+      </w:rPr>
+    </w:lvl>
+    <w:lvl w:ilvl="6">
+      <w:start w:val="1"/>
+      <w:numFmt w:val="bullet"/>
+      <w:lvlText w:val="-"/>
+      <w:lvlJc w:val="left"/>
+      <w:pPr>
+        <w:ind w:left="5040" w:hanging="360"/>
+      </w:pPr>
+      <w:rPr>
+        <w:u w:val="none"/>
+      </w:rPr>
+    </w:lvl>
+    <w:lvl w:ilvl="7">
+      <w:start w:val="1"/>
+      <w:numFmt w:val="bullet"/>
+      <w:lvlText w:val="-"/>
+      <w:lvlJc w:val="left"/>
+      <w:pPr>
+        <w:ind w:left="5760" w:hanging="360"/>
+      </w:pPr>
+      <w:rPr>
+        <w:u w:val="none"/>
+      </w:rPr>
+    </w:lvl>
+    <w:lvl w:ilvl="8">
+      <w:start w:val="1"/>
+      <w:numFmt w:val="bullet"/>
+      <w:lvlText w:val="-"/>
+      <w:lvlJc w:val="left"/>
+      <w:pPr>
+        <w:ind w:left="6480" w:hanging="360"/>
+      </w:pPr>
+      <w:rPr>
+        <w:u w:val="none"/>
+      </w:rPr>
+    </w:lvl>
+  </w:abstractNum>
+  <w:num w:numId="1">
+    <w:abstractNumId w:val="1"/>
+  </w:num>
+  <w:num w:numId="2">
+    <w:abstractNumId w:val="2"/>
+  </w:num>
+</w:numbering>
 </file>
 
 <file path=word/styles.xml><?xml version="1.0" encoding="utf-8"?>
@@ -1136,19 +1440,4 @@
   </a:objectDefaults>
   <a:extraClrSchemeLst/>
 </a:theme>
-</file>
-
-<file path=customXML/item1.xml><?xml version="1.0" encoding="utf-8"?>
-<go:gDocsCustomXmlDataStorage xmlns:go="http://customooxmlschemas.google.com/" xmlns:r="http://schemas.openxmlformats.org/officeDocument/2006/relationships" uri="GoogleDocsCustomDataVersion2">
-  <go:docsCustomData xmlns:go="http://customooxmlschemas.google.com/" roundtripDataSignature="AMtx7mjbUN7lXY2AOoeqo8l0QJV+1J+YUw==">CgMxLjA4AHIhMUdmbzVZR0QxMWFvVXlBYWR5UGxNMDVsOW4wc204VzVm</go:docsCustomData>
-</go:gDocsCustomXmlDataStorage>
-</file>
-
-<file path=customXML/itemProps1.xml><?xml version="1.0" encoding="utf-8"?>
-<ds:datastoreItem xmlns:ds="http://schemas.openxmlformats.org/officeDocument/2006/customXml" ds:itemID="{11111111-1234-1234-1234-123412341234}">
-  <ds:schemaRefs>
-    <ds:schemaRef ds:uri="http://schemas.openxmlformats.org/officeDocument/2006/relationships"/>
-    <ds:schemaRef ds:uri="http://customooxmlschemas.google.com/"/>
-  </ds:schemaRefs>
-</ds:datastoreItem>
 </file>
</xml_diff>